<commit_message>
Synchronize current author revisions and publication metadata
</commit_message>
<xml_diff>
--- a/model/current_results/publication/documents/manuscript.docx
+++ b/model/current_results/publication/documents/manuscript.docx
@@ -170,13 +170,13 @@
         <w:spacing w:line="480" w:lineRule="auto"/>
       </w:pPr>
       <w:r>
-        <w:t xml:space="preserve">Irrigation management in the North China Plain connects grain production with groundwater availability across the winter wheat–summer maize rotation </w:t>
+        <w:t xml:space="preserve">Irrigation management in the North China Plain must reconcile grain production with water-resource constraints across the winter wheat–summer maize rotation </w:t>
       </w:r>
       <w:r>
         <w:fldChar w:fldCharType="begin"/>
       </w:r>
       <w:r>
-        <w:instrText xml:space="preserve"> ADDIN ZOTERO_ITEM CSL_CITATION {"citationID":"e58bb2d2a6ddbd9b","properties":{"formattedCitation":"(Yang et al., 2022)","plainCitation":"(Yang et al., 2022)","noteIndex":0},"citationItems":[{"id":"yang2022_long_term_irrigation","itemData":{"id":"yang2022_long_term_irrigation","type":"article-journal","title":"Reduced groundwater use and increased grain production by optimized irrigation scheduling in winter wheat–summer maize double cropping system—A 16-year field study in North China Plain","author":[{"family":"Yang","given":"Xiaolin"},{"family":"Wang","given":"Guangya"},{"family":"Chen","given":"Yuanquan"},{"family":"Sui","given":"Peng"},{"family":"Pacenka","given":"Steven"},{"family":"Steenhuis","given":"Tammo S."},{"family":"Siddique","given":"Kadambot H.M."}],"issued":{"date-parts":[[2022,1]]},"container-title":"Field Crops Research","container-title-short":"Field Crops Res.","volume":"275","DOI":"10.1016/j.fcr.2021.108364","URL":"https://doi.org/10.1016/j.fcr.2021.108364","accessed":{"date-parts":[[2026,10,3]]},"language":"en","publisher":"Elsevier BV","page":"108364"}}],"schema":"https://github.com/citation-style-language/schema/raw/master/csl-citation.json"} </w:instrText>
+        <w:instrText xml:space="preserve"> ADDIN ZOTERO_ITEM CSL_CITATION {"citationID":"c32ba1be3f47ec20","properties":{"formattedCitation":"(Yang et al., 2022)","plainCitation":"(Yang et al., 2022)","noteIndex":0},"citationItems":[{"id":"yang2022_long_term_irrigation","itemData":{"id":"yang2022_long_term_irrigation","type":"article-journal","title":"Reduced groundwater use and increased grain production by optimized irrigation scheduling in winter wheat–summer maize double cropping system—A 16-year field study in North China Plain","author":[{"family":"Yang","given":"Xiaolin"},{"family":"Wang","given":"Guangya"},{"family":"Chen","given":"Yuanquan"},{"family":"Sui","given":"Peng"},{"family":"Pacenka","given":"Steven"},{"family":"Steenhuis","given":"Tammo S."},{"family":"Siddique","given":"Kadambot H.M."}],"issued":{"date-parts":[[2022,1]]},"container-title":"Field Crops Research","container-title-short":"Field Crops Res.","volume":"275","DOI":"10.1016/j.fcr.2021.108364","URL":"https://doi.org/10.1016/j.fcr.2021.108364","accessed":{"date-parts":[[2026,10,3]]},"language":"en","publisher":"Elsevier BV","page":"108364"}}],"schema":"https://github.com/citation-style-language/schema/raw/master/csl-citation.json"} </w:instrText>
       </w:r>
       <w:r>
         <w:fldChar w:fldCharType="separate"/>
@@ -188,13 +188,13 @@
         <w:fldChar w:fldCharType="end"/>
       </w:r>
       <w:r>
-        <w:t xml:space="preserve">. Wheat grows through a relatively dry season, whereas maize receives more summer rainfall; soil-water reserves link their responses to water supply </w:t>
+        <w:t xml:space="preserve">. Wheat grows through a relatively dry season, whereas maize receives more summer rainfall; soil-water reserves connect their responses to irrigation </w:t>
       </w:r>
       <w:r>
         <w:fldChar w:fldCharType="begin"/>
       </w:r>
       <w:r>
-        <w:instrText xml:space="preserve"> ADDIN ZOTERO_ITEM CSL_CITATION {"citationID":"0a70bb000d2761b0","properties":{"formattedCitation":"(Yang et al., 2024)","plainCitation":"(Yang et al., 2024)","noteIndex":0},"citationItems":[{"id":"yang2024_precipitation","itemData":{"id":"yang2024_precipitation","type":"article-journal","title":"Optimal irrigation for wheat-maize rotation depending on precipitation in the North China Plain: Evidence from a four-year experiment","author":[{"family":"Yang","given":"Lei"},{"family":"Fang","given":"Xiangyang"},{"family":"Zhou","given":"Jie"},{"family":"Zhao","given":"Jie"},{"family":"Hou","given":"Xiqing"},{"family":"Yang","given":"Yadong"},{"family":"Zang","given":"Huadong"},{"family":"Zeng","given":"Zhaohai"}],"issued":{"date-parts":[[2024,4]]},"container-title":"Agricultural Water Management","container-title-short":"Agric. Water Manag.","volume":"294","DOI":"10.1016/j.agwat.2024.108726","URL":"https://doi.org/10.1016/j.agwat.2024.108726","accessed":{"date-parts":[[2026,10,3]]},"language":"en","publisher":"Elsevier BV","page":"108726"}}],"schema":"https://github.com/citation-style-language/schema/raw/master/csl-citation.json"} </w:instrText>
+        <w:instrText xml:space="preserve"> ADDIN ZOTERO_ITEM CSL_CITATION {"citationID":"1043a2bb147d44ad","properties":{"formattedCitation":"(Yang et al., 2024)","plainCitation":"(Yang et al., 2024)","noteIndex":0},"citationItems":[{"id":"yang2024_precipitation","itemData":{"id":"yang2024_precipitation","type":"article-journal","title":"Optimal irrigation for wheat-maize rotation depending on precipitation in the North China Plain: Evidence from a four-year experiment","author":[{"family":"Yang","given":"Lei"},{"family":"Fang","given":"Xiangyang"},{"family":"Zhou","given":"Jie"},{"family":"Zhao","given":"Jie"},{"family":"Hou","given":"Xiqing"},{"family":"Yang","given":"Yadong"},{"family":"Zang","given":"Huadong"},{"family":"Zeng","given":"Zhaohai"}],"issued":{"date-parts":[[2024,4]]},"container-title":"Agricultural Water Management","container-title-short":"Agric. Water Manag.","volume":"294","DOI":"10.1016/j.agwat.2024.108726","URL":"https://doi.org/10.1016/j.agwat.2024.108726","accessed":{"date-parts":[[2026,10,3]]},"language":"en","publisher":"Elsevier BV","page":"108726"}}],"schema":"https://github.com/citation-style-language/schema/raw/master/csl-citation.json"} </w:instrText>
       </w:r>
       <w:r>
         <w:fldChar w:fldCharType="separate"/>
@@ -212,7 +212,7 @@
         <w:fldChar w:fldCharType="begin"/>
       </w:r>
       <w:r>
-        <w:instrText xml:space="preserve"> ADDIN ZOTERO_ITEM CSL_CITATION {"citationID":"f9e8e3a227abb908","properties":{"formattedCitation":"(Zhang et al., 2011)","plainCitation":"(Zhang et al., 2011)","noteIndex":0},"citationItems":[{"id":"zhang2011_et_change","itemData":{"id":"zhang2011_et_change","type":"article-journal","title":"Changes in evapotranspiration over irrigated winter wheat and maize in North China Plain over three decades","author":[{"family":"Zhang","given":"Xiying"},{"family":"Chen","given":"Suying"},{"family":"Sun","given":"Hongyong"},{"family":"Shao","given":"Liwei"},{"family":"Wang","given":"Yanzhe"}],"issued":{"date-parts":[[2011,4]]},"container-title":"Agricultural Water Management","container-title-short":"Agric. Water Manag.","volume":"98","DOI":"10.1016/j.agwat.2011.02.003","URL":"https://doi.org/10.1016/j.agwat.2011.02.003","accessed":{"date-parts":[[2026,10,3]]},"language":"en","publisher":"Elsevier BV","issue":"6","page":"1097-1104"}}],"schema":"https://github.com/citation-style-language/schema/raw/master/csl-citation.json"} </w:instrText>
+        <w:instrText xml:space="preserve"> ADDIN ZOTERO_ITEM CSL_CITATION {"citationID":"85c1eb29a4508c93","properties":{"formattedCitation":"(Zhang et al., 2011)","plainCitation":"(Zhang et al., 2011)","noteIndex":0},"citationItems":[{"id":"zhang2011_et_change","itemData":{"id":"zhang2011_et_change","type":"article-journal","title":"Changes in evapotranspiration over irrigated winter wheat and maize in North China Plain over three decades","author":[{"family":"Zhang","given":"Xiying"},{"family":"Chen","given":"Suying"},{"family":"Sun","given":"Hongyong"},{"family":"Shao","given":"Liwei"},{"family":"Wang","given":"Yanzhe"}],"issued":{"date-parts":[[2011,4]]},"container-title":"Agricultural Water Management","container-title-short":"Agric. Water Manag.","volume":"98","DOI":"10.1016/j.agwat.2011.02.003","URL":"https://doi.org/10.1016/j.agwat.2011.02.003","accessed":{"date-parts":[[2026,10,3]]},"language":"en","publisher":"Elsevier BV","issue":"6","page":"1097-1104"}}],"schema":"https://github.com/citation-style-language/schema/raw/master/csl-citation.json"} </w:instrText>
       </w:r>
       <w:r>
         <w:fldChar w:fldCharType="separate"/>
@@ -224,25 +224,7 @@
         <w:fldChar w:fldCharType="end"/>
       </w:r>
       <w:r>
-        <w:t xml:space="preserve">. Recent aquifer recovery under water transfers, abstraction management and changing climate further emphasizes the connection between agricultural production and regional water-resource objectives </w:t>
-      </w:r>
-      <w:r>
-        <w:fldChar w:fldCharType="begin"/>
-      </w:r>
-      <w:r>
-        <w:instrText xml:space="preserve"> ADDIN ZOTERO_ITEM CSL_CITATION {"citationID":"778f493df99ff4be","properties":{"formattedCitation":"(Long et al., 2025; Xu et al., 2026)","plainCitation":"(Long et al., 2025; Xu et al., 2026)","noteIndex":0},"citationItems":[{"id":"long2025_aquifer_recovery","itemData":{"id":"long2025_aquifer_recovery","type":"article-journal","title":"Unprecedented large-scale aquifer recovery through human intervention","author":[{"family":"Long","given":"Di"},{"family":"Xu","given":"Yuancheng"},{"family":"Cui","given":"Yingjie"},{"family":"Cui","given":"Yanhong"},{"family":"Butler","given":"James J."},{"family":"Dong","given":"Liang"},{"family":"Wang","given":"Longfeng"},{"family":"Liu","given":"Dongyong"},{"family":"Wada","given":"Yoshihide"},{"family":"Hu","given":"Litang"},{"family":"Bai","given":"Guoying"},{"family":"Li","given":"Binghua"},{"family":"Wang","given":"Shufang"},{"family":"Nong","given":"Xizhi"},{"family":"Cai","given":"Yang"},{"family":"Cheng","given":"Chunsheng"},{"family":"Mu","given":"Yuhan"},{"family":"Qiao","given":"Yu"},{"family":"Wang","given":"Jianhua"},{"family":"Wang","given":"Hao"},{"family":"Scanlon","given":"Bridget R."}],"issued":{"date-parts":[[2025,8,7]]},"container-title":"Nature Communications","container-title-short":"Nat. Commun.","volume":"16","DOI":"10.1038/s41467-025-62719-5","URL":"https://doi.org/10.1038/s41467-025-62719-5","accessed":{"date-parts":[[2026,10,3]]},"language":"en","publisher":"Springer Science and Business Media LLC","issue":"1","page":"7296"}},{"id":"xu2026_groundwater_recovery","itemData":{"id":"xu2026_groundwater_recovery","type":"article-journal","title":"Quantifying Human and Climatic Contributions of Large‐Scale Groundwater Recovery in the North China Plain","author":[{"family":"Xu","given":"Yuancheng"},{"family":"Long","given":"Di"},{"family":"Jiang","given":"Wenyu"},{"family":"Cui","given":"Yingjie"},{"family":"Chen","given":"Fei"},{"family":"Wang","given":"Jianhua"},{"family":"Wada","given":"Yoshihide"}],"issued":{"date-parts":[[2026,7]]},"container-title":"Water Resources Research","container-title-short":"Water Resour. Res.","volume":"62","DOI":"10.1029/2025wr043052","URL":"https://doi.org/10.1029/2025wr043052","accessed":{"date-parts":[[2026,10,3]]},"language":"en","publisher":"American Geophysical Union (AGU)","issue":"7","page":"e2025WR043052"}}],"schema":"https://github.com/citation-style-language/schema/raw/master/csl-citation.json"} </w:instrText>
-      </w:r>
-      <w:r>
-        <w:fldChar w:fldCharType="separate"/>
-      </w:r>
-      <w:r>
-        <w:t>(Long et al., 2025; Xu et al., 2026)</w:t>
-      </w:r>
-      <w:r>
-        <w:fldChar w:fldCharType="end"/>
-      </w:r>
-      <w:r>
-        <w:t>. Irrigation decisions consequently involve the water delivered to fields, the grain it supports and the water consumed over the complete rotation.</w:t>
+        <w:t>. Maintaining production with less irrigation therefore requires attention to both the water delivered to fields and the water consumed over the complete rotation.</w:t>
       </w:r>
     </w:p>
     <w:p>
@@ -250,13 +232,13 @@
         <w:spacing w:line="480" w:lineRule="auto"/>
       </w:pPr>
       <w:r>
-        <w:t xml:space="preserve">The production return from that delivery depends on rainfall and preceding crop management. A sixteen-year experiment in 2003–2018 compared seven wheat–maize irrigation schedules and found diminishing marginal production gains as irrigation increased </w:t>
+        <w:t xml:space="preserve">The timing and location of irrigation supply determine its marginal production return. A sixteen-year experiment in 2003–2018 compared seven wheat–maize irrigation schedules and found diminishing production gains as irrigation increased </w:t>
       </w:r>
       <w:r>
         <w:fldChar w:fldCharType="begin"/>
       </w:r>
       <w:r>
-        <w:instrText xml:space="preserve"> ADDIN ZOTERO_ITEM CSL_CITATION {"citationID":"6b1ddf1c2719752a","properties":{"formattedCitation":"(Yang et al., 2022)","plainCitation":"(Yang et al., 2022)","noteIndex":0},"citationItems":[{"id":"yang2022_long_term_irrigation","itemData":{"id":"yang2022_long_term_irrigation","type":"article-journal","title":"Reduced groundwater use and increased grain production by optimized irrigation scheduling in winter wheat–summer maize double cropping system—A 16-year field study in North China Plain","author":[{"family":"Yang","given":"Xiaolin"},{"family":"Wang","given":"Guangya"},{"family":"Chen","given":"Yuanquan"},{"family":"Sui","given":"Peng"},{"family":"Pacenka","given":"Steven"},{"family":"Steenhuis","given":"Tammo S."},{"family":"Siddique","given":"Kadambot H.M."}],"issued":{"date-parts":[[2022,1]]},"container-title":"Field Crops Research","container-title-short":"Field Crops Res.","volume":"275","DOI":"10.1016/j.fcr.2021.108364","URL":"https://doi.org/10.1016/j.fcr.2021.108364","accessed":{"date-parts":[[2026,10,3]]},"language":"en","publisher":"Elsevier BV","page":"108364"}}],"schema":"https://github.com/citation-style-language/schema/raw/master/csl-citation.json"} </w:instrText>
+        <w:instrText xml:space="preserve"> ADDIN ZOTERO_ITEM CSL_CITATION {"citationID":"c1f255713f8c4c15","properties":{"formattedCitation":"(Yang et al., 2022)","plainCitation":"(Yang et al., 2022)","noteIndex":0},"citationItems":[{"id":"yang2022_long_term_irrigation","itemData":{"id":"yang2022_long_term_irrigation","type":"article-journal","title":"Reduced groundwater use and increased grain production by optimized irrigation scheduling in winter wheat–summer maize double cropping system—A 16-year field study in North China Plain","author":[{"family":"Yang","given":"Xiaolin"},{"family":"Wang","given":"Guangya"},{"family":"Chen","given":"Yuanquan"},{"family":"Sui","given":"Peng"},{"family":"Pacenka","given":"Steven"},{"family":"Steenhuis","given":"Tammo S."},{"family":"Siddique","given":"Kadambot H.M."}],"issued":{"date-parts":[[2022,1]]},"container-title":"Field Crops Research","container-title-short":"Field Crops Res.","volume":"275","DOI":"10.1016/j.fcr.2021.108364","URL":"https://doi.org/10.1016/j.fcr.2021.108364","accessed":{"date-parts":[[2026,10,3]]},"language":"en","publisher":"Elsevier BV","page":"108364"}}],"schema":"https://github.com/citation-style-language/schema/raw/master/csl-citation.json"} </w:instrText>
       </w:r>
       <w:r>
         <w:fldChar w:fldCharType="separate"/>
@@ -268,13 +250,13 @@
         <w:fldChar w:fldCharType="end"/>
       </w:r>
       <w:r>
-        <w:t xml:space="preserve">. A four-year Wuqiao experiment showed that precipitation conditions influenced the preferred wheat schedule and grain production in the subsequent maize crop </w:t>
+        <w:t xml:space="preserve">. A four-year Wuqiao experiment also showed that precipitation conditions influenced the preferred wheat schedule and grain production in the subsequent maize crop </w:t>
       </w:r>
       <w:r>
         <w:fldChar w:fldCharType="begin"/>
       </w:r>
       <w:r>
-        <w:instrText xml:space="preserve"> ADDIN ZOTERO_ITEM CSL_CITATION {"citationID":"622d4aae24895904","properties":{"formattedCitation":"(Yang et al., 2024)","plainCitation":"(Yang et al., 2024)","noteIndex":0},"citationItems":[{"id":"yang2024_precipitation","itemData":{"id":"yang2024_precipitation","type":"article-journal","title":"Optimal irrigation for wheat-maize rotation depending on precipitation in the North China Plain: Evidence from a four-year experiment","author":[{"family":"Yang","given":"Lei"},{"family":"Fang","given":"Xiangyang"},{"family":"Zhou","given":"Jie"},{"family":"Zhao","given":"Jie"},{"family":"Hou","given":"Xiqing"},{"family":"Yang","given":"Yadong"},{"family":"Zang","given":"Huadong"},{"family":"Zeng","given":"Zhaohai"}],"issued":{"date-parts":[[2024,4]]},"container-title":"Agricultural Water Management","container-title-short":"Agric. Water Manag.","volume":"294","DOI":"10.1016/j.agwat.2024.108726","URL":"https://doi.org/10.1016/j.agwat.2024.108726","accessed":{"date-parts":[[2026,10,3]]},"language":"en","publisher":"Elsevier BV","page":"108726"}}],"schema":"https://github.com/citation-style-language/schema/raw/master/csl-citation.json"} </w:instrText>
+        <w:instrText xml:space="preserve"> ADDIN ZOTERO_ITEM CSL_CITATION {"citationID":"df95b90af4db53c1","properties":{"formattedCitation":"(Yang et al., 2024)","plainCitation":"(Yang et al., 2024)","noteIndex":0},"citationItems":[{"id":"yang2024_precipitation","itemData":{"id":"yang2024_precipitation","type":"article-journal","title":"Optimal irrigation for wheat-maize rotation depending on precipitation in the North China Plain: Evidence from a four-year experiment","author":[{"family":"Yang","given":"Lei"},{"family":"Fang","given":"Xiangyang"},{"family":"Zhou","given":"Jie"},{"family":"Zhao","given":"Jie"},{"family":"Hou","given":"Xiqing"},{"family":"Yang","given":"Yadong"},{"family":"Zang","given":"Huadong"},{"family":"Zeng","given":"Zhaohai"}],"issued":{"date-parts":[[2024,4]]},"container-title":"Agricultural Water Management","container-title-short":"Agric. Water Manag.","volume":"294","DOI":"10.1016/j.agwat.2024.108726","URL":"https://doi.org/10.1016/j.agwat.2024.108726","accessed":{"date-parts":[[2026,10,3]]},"language":"en","publisher":"Elsevier BV","page":"108726"}}],"schema":"https://github.com/citation-style-language/schema/raw/master/csl-citation.json"} </w:instrText>
       </w:r>
       <w:r>
         <w:fldChar w:fldCharType="separate"/>
@@ -286,13 +268,13 @@
         <w:fldChar w:fldCharType="end"/>
       </w:r>
       <w:r>
-        <w:t xml:space="preserve">. Water applied to wheat can support its immediate growth and leave a different soil-water reserve for maize. The annual response to an irrigation reduction therefore depends on the sequence of crop demand, rainfall and storage changes across both seasons </w:t>
+        <w:t xml:space="preserve">. These responses reflect the sequence of crop demand, rainfall and soil-water carry-over across both seasons </w:t>
       </w:r>
       <w:r>
         <w:fldChar w:fldCharType="begin"/>
       </w:r>
       <w:r>
-        <w:instrText xml:space="preserve"> ADDIN ZOTERO_ITEM CSL_CITATION {"citationID":"e3020388af151266","properties":{"formattedCitation":"(Yang et al., 2024; Yang et al., 2022)","plainCitation":"(Yang et al., 2024; Yang et al., 2022)","noteIndex":0},"citationItems":[{"id":"yang2022_long_term_irrigation","itemData":{"id":"yang2022_long_term_irrigation","type":"article-journal","title":"Reduced groundwater use and increased grain production by optimized irrigation scheduling in winter wheat–summer maize double cropping system—A 16-year field study in North China Plain","author":[{"family":"Yang","given":"Xiaolin"},{"family":"Wang","given":"Guangya"},{"family":"Chen","given":"Yuanquan"},{"family":"Sui","given":"Peng"},{"family":"Pacenka","given":"Steven"},{"family":"Steenhuis","given":"Tammo S."},{"family":"Siddique","given":"Kadambot H.M."}],"issued":{"date-parts":[[2022,1]]},"container-title":"Field Crops Research","container-title-short":"Field Crops Res.","volume":"275","DOI":"10.1016/j.fcr.2021.108364","URL":"https://doi.org/10.1016/j.fcr.2021.108364","accessed":{"date-parts":[[2026,10,3]]},"language":"en","publisher":"Elsevier BV","page":"108364"}},{"id":"yang2024_precipitation","itemData":{"id":"yang2024_precipitation","type":"article-journal","title":"Optimal irrigation for wheat-maize rotation depending on precipitation in the North China Plain: Evidence from a four-year experiment","author":[{"family":"Yang","given":"Lei"},{"family":"Fang","given":"Xiangyang"},{"family":"Zhou","given":"Jie"},{"family":"Zhao","given":"Jie"},{"family":"Hou","given":"Xiqing"},{"family":"Yang","given":"Yadong"},{"family":"Zang","given":"Huadong"},{"family":"Zeng","given":"Zhaohai"}],"issued":{"date-parts":[[2024,4]]},"container-title":"Agricultural Water Management","container-title-short":"Agric. Water Manag.","volume":"294","DOI":"10.1016/j.agwat.2024.108726","URL":"https://doi.org/10.1016/j.agwat.2024.108726","accessed":{"date-parts":[[2026,10,3]]},"language":"en","publisher":"Elsevier BV","page":"108726"}}],"schema":"https://github.com/citation-style-language/schema/raw/master/csl-citation.json"} </w:instrText>
+        <w:instrText xml:space="preserve"> ADDIN ZOTERO_ITEM CSL_CITATION {"citationID":"0956cef3d5316b43","properties":{"formattedCitation":"(Yang et al., 2024; Yang et al., 2022)","plainCitation":"(Yang et al., 2024; Yang et al., 2022)","noteIndex":0},"citationItems":[{"id":"yang2022_long_term_irrigation","itemData":{"id":"yang2022_long_term_irrigation","type":"article-journal","title":"Reduced groundwater use and increased grain production by optimized irrigation scheduling in winter wheat–summer maize double cropping system—A 16-year field study in North China Plain","author":[{"family":"Yang","given":"Xiaolin"},{"family":"Wang","given":"Guangya"},{"family":"Chen","given":"Yuanquan"},{"family":"Sui","given":"Peng"},{"family":"Pacenka","given":"Steven"},{"family":"Steenhuis","given":"Tammo S."},{"family":"Siddique","given":"Kadambot H.M."}],"issued":{"date-parts":[[2022,1]]},"container-title":"Field Crops Research","container-title-short":"Field Crops Res.","volume":"275","DOI":"10.1016/j.fcr.2021.108364","URL":"https://doi.org/10.1016/j.fcr.2021.108364","accessed":{"date-parts":[[2026,10,3]]},"language":"en","publisher":"Elsevier BV","page":"108364"}},{"id":"yang2024_precipitation","itemData":{"id":"yang2024_precipitation","type":"article-journal","title":"Optimal irrigation for wheat-maize rotation depending on precipitation in the North China Plain: Evidence from a four-year experiment","author":[{"family":"Yang","given":"Lei"},{"family":"Fang","given":"Xiangyang"},{"family":"Zhou","given":"Jie"},{"family":"Zhao","given":"Jie"},{"family":"Hou","given":"Xiqing"},{"family":"Yang","given":"Yadong"},{"family":"Zang","given":"Huadong"},{"family":"Zeng","given":"Zhaohai"}],"issued":{"date-parts":[[2024,4]]},"container-title":"Agricultural Water Management","container-title-short":"Agric. Water Manag.","volume":"294","DOI":"10.1016/j.agwat.2024.108726","URL":"https://doi.org/10.1016/j.agwat.2024.108726","accessed":{"date-parts":[[2026,10,3]]},"language":"en","publisher":"Elsevier BV","page":"108726"}}],"schema":"https://github.com/citation-style-language/schema/raw/master/csl-citation.json"} </w:instrText>
       </w:r>
       <w:r>
         <w:fldChar w:fldCharType="separate"/>
@@ -304,7 +286,43 @@
         <w:fldChar w:fldCharType="end"/>
       </w:r>
       <w:r>
-        <w:t>.</w:t>
+        <w:t xml:space="preserve">. At regional scale, irrigation requirements vary among locations and hydrological years </w:t>
+      </w:r>
+      <w:r>
+        <w:fldChar w:fldCharType="begin"/>
+      </w:r>
+      <w:r>
+        <w:instrText xml:space="preserve"> ADDIN ZOTERO_ITEM CSL_CITATION {"citationID":"bd4173214fcd7823","properties":{"formattedCitation":"(Ren et al., 2022; Wu et al., 2019)","plainCitation":"(Ren et al., 2022; Wu et al., 2019)","noteIndex":0},"citationItems":[{"id":"wu2019_spatial_irrigation","itemData":{"id":"wu2019_spatial_irrigation","type":"article-journal","title":"Spatial-temporal variation in irrigation water requirement for the winter wheat-summer maize rotation system since the 1980s on the North China Plain","author":[{"family":"Wu","given":"Dong"},{"family":"Fang","given":"Shibo"},{"family":"Li","given":"Xuan"},{"family":"He","given":"Di"},{"family":"Zhu","given":"Yongchao"},{"family":"Yang","given":"Zaiqiang"},{"family":"Xu","given":"Jiaxin"},{"family":"Wu","given":"Yingjie"}],"issued":{"date-parts":[[2019,4]]},"container-title":"Agricultural Water Management","container-title-short":"Agric. Water Manag.","volume":"214","DOI":"10.1016/j.agwat.2019.01.004","URL":"https://doi.org/10.1016/j.agwat.2019.01.004","accessed":{"date-parts":[[2026,10,3]]},"language":"en","publisher":"Elsevier BV","page":"78-86"}},{"id":"ren2022_regional_water","itemData":{"id":"ren2022_regional_water","type":"article-journal","title":"Spatiotemporal patterns of water consumption and irrigation requirements of wheat-maize in the Huang-Huai-Hai Plain, China and options of their reduction","author":[{"family":"Ren","given":"Pinpin"},{"family":"Huang","given":"Feng"},{"family":"Li","given":"Baoguo"}],"issued":{"date-parts":[[2022,4]]},"container-title":"Agricultural Water Management","container-title-short":"Agric. Water Manag.","volume":"263","DOI":"10.1016/j.agwat.2022.107468","URL":"https://doi.org/10.1016/j.agwat.2022.107468","accessed":{"date-parts":[[2026,10,3]]},"language":"en","publisher":"Elsevier BV","page":"107468"}}],"schema":"https://github.com/citation-style-language/schema/raw/master/csl-citation.json"} </w:instrText>
+      </w:r>
+      <w:r>
+        <w:fldChar w:fldCharType="separate"/>
+      </w:r>
+      <w:r>
+        <w:t>(Ren et al., 2022; Wu et al., 2019)</w:t>
+      </w:r>
+      <w:r>
+        <w:fldChar w:fldCharType="end"/>
+      </w:r>
+      <w:r>
+        <w:t xml:space="preserve">. Crop-model optimization and irrigation-allocation studies provide approaches for using this heterogeneity to guide management </w:t>
+      </w:r>
+      <w:r>
+        <w:fldChar w:fldCharType="begin"/>
+      </w:r>
+      <w:r>
+        <w:instrText xml:space="preserve"> ADDIN ZOTERO_ITEM CSL_CITATION {"citationID":"4c74c18de32ecee6","properties":{"formattedCitation":"(Jiang et al., 2016; Xiao et al., 2024)","plainCitation":"(Jiang et al., 2016; Xiao et al., 2024)","noteIndex":0},"citationItems":[{"id":"xiao2024_management_optimization","itemData":{"id":"xiao2024_management_optimization","type":"article-journal","title":"Spatiotemporal co-optimization of agricultural management practices towards climate-smart crop production","author":[{"given":"Liujun","family":"Xiao"},{"given":"Guocheng","family":"Wang"},{"given":"Enli","family":"Wang"},{"given":"Shengli","family":"Liu"},{"given":"Jinfeng","family":"Chang"},{"given":"Ping","family":"Zhang"},{"given":"Hangxin","family":"Zhou"},{"given":"Yuchen","family":"Wei"},{"given":"Haoyu","family":"Zhang"},{"given":"Yan","family":"Zhu"},{"given":"Zhou","family":"Shi"},{"given":"Zhongkui","family":"Luo"}],"container-title":"Nature Food","volume":"5","page":"59-71","issued":{"date-parts":[[2024,1,2]]},"DOI":"10.1038/s43016-023-00891-x","URL":"https://doi.org/10.1038/s43016-023-00891-x"}},{"id":"jiang2016_regional_optimization","itemData":{"id":"jiang2016_regional_optimization","type":"article-journal","title":"Optimizing regional irrigation water use by integrating a two-level optimization model and an agro-hydrological model","author":[{"family":"Jiang","given":"Yao"},{"family":"Xu","given":"Xu"},{"family":"Huang","given":"Quanzhong"},{"family":"Huo","given":"Zailin"},{"family":"Huang","given":"Guanhua"}],"issued":{"date-parts":[[2016,12]]},"DOI":"10.1016/j.agwat.2016.08.035","URL":"https://doi.org/10.1016/j.agwat.2016.08.035","accessed":{"date-parts":[[2026,10,4]]},"container-title":"Agricultural Water Management","volume":"178","page":"76-88"}}],"schema":"https://github.com/citation-style-language/schema/raw/master/csl-citation.json"} </w:instrText>
+      </w:r>
+      <w:r>
+        <w:fldChar w:fldCharType="separate"/>
+      </w:r>
+      <w:r>
+        <w:t>(Jiang et al., 2016; Xiao et al., 2024)</w:t>
+      </w:r>
+      <w:r>
+        <w:fldChar w:fldCharType="end"/>
+      </w:r>
+      <w:r>
+        <w:t>. Under a common water budget, targeting locations with larger marginal grain returns can improve regional production retention, while changing the distribution of production losses.</w:t>
       </w:r>
     </w:p>
     <w:p>
@@ -312,61 +330,61 @@
         <w:spacing w:line="480" w:lineRule="auto"/>
       </w:pPr>
       <w:r>
-        <w:t xml:space="preserve">These temporal dependencies occur within a spatially heterogeneous region. Irrigation requirements vary across the North China Plain and among hydrological years in the broader Huang–Huai–Hai Plain </w:t>
+        <w:t xml:space="preserve">Assessing these allocation consequences requires consistent crop and water accounting. Field delivery, ET, return flows and storage changes describe different quantities, so a reduction in irrigation does not directly establish an equivalent reduction in consumption </w:t>
       </w:r>
       <w:r>
         <w:fldChar w:fldCharType="begin"/>
       </w:r>
       <w:r>
-        <w:instrText xml:space="preserve"> ADDIN ZOTERO_ITEM CSL_CITATION {"citationID":"867c24fffd53b53a","properties":{"formattedCitation":"(Ren et al., 2022; Wu et al., 2019)","plainCitation":"(Ren et al., 2022; Wu et al., 2019)","noteIndex":0},"citationItems":[{"id":"wu2019_spatial_irrigation","itemData":{"id":"wu2019_spatial_irrigation","type":"article-journal","title":"Spatial-temporal variation in irrigation water requirement for the winter wheat-summer maize rotation system since the 1980s on the North China Plain","author":[{"family":"Wu","given":"Dong"},{"family":"Fang","given":"Shibo"},{"family":"Li","given":"Xuan"},{"family":"He","given":"Di"},{"family":"Zhu","given":"Yongchao"},{"family":"Yang","given":"Zaiqiang"},{"family":"Xu","given":"Jiaxin"},{"family":"Wu","given":"Yingjie"}],"issued":{"date-parts":[[2019,4]]},"container-title":"Agricultural Water Management","container-title-short":"Agric. Water Manag.","volume":"214","DOI":"10.1016/j.agwat.2019.01.004","URL":"https://doi.org/10.1016/j.agwat.2019.01.004","accessed":{"date-parts":[[2026,10,3]]},"language":"en","publisher":"Elsevier BV","page":"78-86"}},{"id":"ren2022_regional_water","itemData":{"id":"ren2022_regional_water","type":"article-journal","title":"Spatiotemporal patterns of water consumption and irrigation requirements of wheat-maize in the Huang-Huai-Hai Plain, China and options of their reduction","author":[{"family":"Ren","given":"Pinpin"},{"family":"Huang","given":"Feng"},{"family":"Li","given":"Baoguo"}],"issued":{"date-parts":[[2022,4]]},"container-title":"Agricultural Water Management","container-title-short":"Agric. Water Manag.","volume":"263","DOI":"10.1016/j.agwat.2022.107468","URL":"https://doi.org/10.1016/j.agwat.2022.107468","accessed":{"date-parts":[[2026,10,3]]},"language":"en","publisher":"Elsevier BV","page":"107468"}}],"schema":"https://github.com/citation-style-language/schema/raw/master/csl-citation.json"} </w:instrText>
+        <w:instrText xml:space="preserve"> ADDIN ZOTERO_ITEM CSL_CITATION {"citationID":"8dab783e8816a292","properties":{"formattedCitation":"(Grafton et al., 2018; Perry et al., 2009)","plainCitation":"(Grafton et al., 2018; Perry et al., 2009)","noteIndex":0},"citationItems":[{"id":"perry2009_water_accounting","itemData":{"id":"perry2009_water_accounting","type":"article-journal","title":"Increasing productivity in irrigated agriculture: Agronomic constraints and hydrological realities","author":[{"family":"Perry","given":"Chris"},{"family":"Steduto","given":"Pasquale"},{"family":"Allen","given":"Richard. G."},{"family":"Burt","given":"Charles M."}],"issued":{"date-parts":[[2009,11]]},"container-title":"Agricultural Water Management","container-title-short":"Agric. Water Manag.","volume":"96","DOI":"10.1016/j.agwat.2009.05.005","URL":"https://doi.org/10.1016/j.agwat.2009.05.005","accessed":{"date-parts":[[2026,10,3]]},"language":"en","publisher":"Elsevier BV","issue":"11","page":"1517-1524"}},{"id":"grafton2018_irrigation_paradox","itemData":{"id":"grafton2018_irrigation_paradox","type":"article-journal","title":"The paradox of irrigation efficiency","author":[{"family":"Grafton","given":"R. Q."},{"family":"Williams","given":"J."},{"family":"Perry","given":"C. J."},{"family":"Molle","given":"F."},{"family":"Ringler","given":"C."},{"family":"Steduto","given":"P."},{"family":"Udall","given":"B."},{"family":"Wheeler","given":"S. A."},{"family":"Wang","given":"Y."},{"family":"Garrick","given":"D."},{"family":"Allen","given":"R. G."}],"issued":{"date-parts":[[2018,8,24]]},"container-title":"Science","container-title-short":"Science","volume":"361","DOI":"10.1126/science.aat9314","URL":"https://doi.org/10.1126/science.aat9314","accessed":{"date-parts":[[2026,10,3]]},"language":"en","publisher":"American Association for the Advancement of Science (AAAS)","issue":"6404","page":"748-750"}}],"schema":"https://github.com/citation-style-language/schema/raw/master/csl-citation.json"} </w:instrText>
       </w:r>
       <w:r>
         <w:fldChar w:fldCharType="separate"/>
       </w:r>
       <w:r>
-        <w:t>(Ren et al., 2022; Wu et al., 2019)</w:t>
+        <w:t>(Grafton et al., 2018; Perry et al., 2009)</w:t>
       </w:r>
       <w:r>
         <w:fldChar w:fldCharType="end"/>
       </w:r>
       <w:r>
-        <w:t xml:space="preserve">. Regional crop-model optimization and irrigation-allocation studies demonstrate how climate, soil and crop responses can inform management choices </w:t>
+        <w:t xml:space="preserve">. Process-based applications of APSIM and RZ-SHAW in the North China Plain connect crop production with water productivity, field water balance and ET </w:t>
       </w:r>
       <w:r>
         <w:fldChar w:fldCharType="begin"/>
       </w:r>
       <w:r>
-        <w:instrText xml:space="preserve"> ADDIN ZOTERO_ITEM CSL_CITATION {"citationID":"fce96d9b7b628059","properties":{"formattedCitation":"(Jiang et al., 2016; Xiao et al., 2024)","plainCitation":"(Jiang et al., 2016; Xiao et al., 2024)","noteIndex":0},"citationItems":[{"id":"xiao2024_management_optimization","itemData":{"id":"xiao2024_management_optimization","type":"article-journal","title":"Spatiotemporal co-optimization of agricultural management practices towards climate-smart crop production","author":[{"given":"Liujun","family":"Xiao"},{"given":"Guocheng","family":"Wang"},{"given":"Enli","family":"Wang"},{"given":"Shengli","family":"Liu"},{"given":"Jinfeng","family":"Chang"},{"given":"Ping","family":"Zhang"},{"given":"Hangxin","family":"Zhou"},{"given":"Yuchen","family":"Wei"},{"given":"Haoyu","family":"Zhang"},{"given":"Yan","family":"Zhu"},{"given":"Zhou","family":"Shi"},{"given":"Zhongkui","family":"Luo"}],"container-title":"Nature Food","volume":"5","page":"59-71","issued":{"date-parts":[[2024,1,2]]},"DOI":"10.1038/s43016-023-00891-x","URL":"https://doi.org/10.1038/s43016-023-00891-x"}},{"id":"jiang2016_regional_optimization","itemData":{"id":"jiang2016_regional_optimization","type":"article-journal","title":"Optimizing regional irrigation water use by integrating a two-level optimization model and an agro-hydrological model","author":[{"family":"Jiang","given":"Yao"},{"family":"Xu","given":"Xu"},{"family":"Huang","given":"Quanzhong"},{"family":"Huo","given":"Zailin"},{"family":"Huang","given":"Guanhua"}],"issued":{"date-parts":[[2016,12]]},"DOI":"10.1016/j.agwat.2016.08.035","URL":"https://doi.org/10.1016/j.agwat.2016.08.035","accessed":{"date-parts":[[2026,10,4]]},"container-title":"Agricultural Water Management","volume":"178","page":"76-88"}}],"schema":"https://github.com/citation-style-language/schema/raw/master/csl-citation.json"} </w:instrText>
+        <w:instrText xml:space="preserve"> ADDIN ZOTERO_ITEM CSL_CITATION {"citationID":"aebb2f0ab4456a76","properties":{"formattedCitation":"(Chen et al., 2010; Fang et al., 2014)","plainCitation":"(Chen et al., 2010; Fang et al., 2014)","noteIndex":0},"citationItems":[{"id":"chen2010_climate_water","itemData":{"id":"chen2010_climate_water","type":"article-journal","title":"Modelling the effects of climate variability and water management on crop water productivity and water balance in the North China Plain","author":[{"family":"Chen","given":"Chao"},{"family":"Wang","given":"Enli"},{"family":"Yu","given":"Qiang"}],"issued":{"date-parts":[[2010,8]]},"container-title":"Agricultural Water Management","container-title-short":"Agric. Water Manag.","volume":"97","DOI":"10.1016/j.agwat.2008.11.012","URL":"https://doi.org/10.1016/j.agwat.2008.11.012","accessed":{"date-parts":[[2026,10,3]]},"language":"en","publisher":"Elsevier BV","issue":"8","page":"1175-1184"}},{"id":"fang2014","itemData":{"id":"fang2014","type":"article-journal","title":"Modeling evapotranspiration and energy balance in a wheat–maize cropping system using the revised RZ-SHAW model","author":[{"given":"Q.X.","family":"Fang"},{"given":"L.","family":"Ma"},{"given":"G.N.","family":"Flerchinger"},{"given":"Z.","family":"Qi"},{"given":"L.R.","family":"Ahuja"},{"given":"H.T.","family":"Xing"},{"given":"J.","family":"Li"},{"given":"Q.","family":"Yu"}],"issued":{"date-parts":[[2014,8]]},"DOI":"10.1016/j.agrformet.2014.04.009","URL":"https://doi.org/10.1016/j.agrformet.2014.04.009","container-title":"Agricultural and Forest Meteorology","volume":"194","page":"218-229"}}],"schema":"https://github.com/citation-style-language/schema/raw/master/csl-citation.json"} </w:instrText>
       </w:r>
       <w:r>
         <w:fldChar w:fldCharType="separate"/>
       </w:r>
       <w:r>
-        <w:t>(Jiang et al., 2016; Xiao et al., 2024)</w:t>
+        <w:t>(Chen et al., 2010; Fang et al., 2014)</w:t>
       </w:r>
       <w:r>
         <w:fldChar w:fldCharType="end"/>
       </w:r>
       <w:r>
-        <w:t xml:space="preserve">. Under a limited regional supply, spatial allocation depends on the additional grain obtained from an additional unit of irrigation. An equal-budget comparison with uniform reductions can quantify the production benefit of retaining water in more responsive systems. That benefit also has a water-accounting and distributional dimension: delivery, ET, return flows and storage change represent different boundaries, and a regional grain gain can coexist with losses at particular locations </w:t>
+        <w:t xml:space="preserve">. However, transpiration formulation remains a major source of variation in simulated wheat water use </w:t>
       </w:r>
       <w:r>
         <w:fldChar w:fldCharType="begin"/>
       </w:r>
       <w:r>
-        <w:instrText xml:space="preserve"> ADDIN ZOTERO_ITEM CSL_CITATION {"citationID":"f7ca14de5b36abf3","properties":{"formattedCitation":"(Grafton et al., 2018; Perry et al., 2009)","plainCitation":"(Grafton et al., 2018; Perry et al., 2009)","noteIndex":0},"citationItems":[{"id":"perry2009_water_accounting","itemData":{"id":"perry2009_water_accounting","type":"article-journal","title":"Increasing productivity in irrigated agriculture: Agronomic constraints and hydrological realities","author":[{"family":"Perry","given":"Chris"},{"family":"Steduto","given":"Pasquale"},{"family":"Allen","given":"Richard. G."},{"family":"Burt","given":"Charles M."}],"issued":{"date-parts":[[2009,11]]},"container-title":"Agricultural Water Management","container-title-short":"Agric. Water Manag.","volume":"96","DOI":"10.1016/j.agwat.2009.05.005","URL":"https://doi.org/10.1016/j.agwat.2009.05.005","accessed":{"date-parts":[[2026,10,3]]},"language":"en","publisher":"Elsevier BV","issue":"11","page":"1517-1524"}},{"id":"grafton2018_irrigation_paradox","itemData":{"id":"grafton2018_irrigation_paradox","type":"article-journal","title":"The paradox of irrigation efficiency","author":[{"family":"Grafton","given":"R. Q."},{"family":"Williams","given":"J."},{"family":"Perry","given":"C. J."},{"family":"Molle","given":"F."},{"family":"Ringler","given":"C."},{"family":"Steduto","given":"P."},{"family":"Udall","given":"B."},{"family":"Wheeler","given":"S. A."},{"family":"Wang","given":"Y."},{"family":"Garrick","given":"D."},{"family":"Allen","given":"R. G."}],"issued":{"date-parts":[[2018,8,24]]},"container-title":"Science","container-title-short":"Science","volume":"361","DOI":"10.1126/science.aat9314","URL":"https://doi.org/10.1126/science.aat9314","accessed":{"date-parts":[[2026,10,3]]},"language":"en","publisher":"American Association for the Advancement of Science (AAAS)","issue":"6404","page":"748-750"}}],"schema":"https://github.com/citation-style-language/schema/raw/master/csl-citation.json"} </w:instrText>
+        <w:instrText xml:space="preserve"> ADDIN ZOTERO_ITEM CSL_CITATION {"citationID":"4d05d0225e54dfaf","properties":{"formattedCitation":"(Cammarano et al., 2016)","plainCitation":"(Cammarano et al., 2016)","noteIndex":0},"citationItems":[{"id":"cammarano2016_water_use","itemData":{"id":"cammarano2016_water_use","type":"article-journal","title":"Uncertainty of wheat water use: Simulated patterns and sensitivity to temperature and CO2","author":[{"family":"Cammarano","given":"Davide"},{"family":"Rötter","given":"Reimund P."},{"family":"Asseng","given":"Senthold"},{"family":"Ewert","given":"Frank"},{"family":"Wallach","given":"Daniel"},{"family":"Martre","given":"Pierre"},{"family":"Hatfield","given":"Jerry L."},{"family":"Jones","given":"James W."},{"family":"Rosenzweig","given":"Cynthia"},{"family":"Ruane","given":"Alex C."},{"family":"Boote","given":"Kenneth J."},{"family":"Thorburn","given":"Peter J."},{"family":"Kersebaum","given":"Kurt Christian"},{"family":"Aggarwal","given":"Pramod K."},{"family":"Angulo","given":"Carlos"},{"family":"Basso","given":"Bruno"},{"family":"Bertuzzi","given":"Patrick"},{"family":"Biernath","given":"Christian"},{"family":"Brisson","given":"Nadine"},{"family":"Challinor","given":"Andrew J."},{"family":"Doltra","given":"Jordi"},{"family":"Gayler","given":"Sebastian"},{"family":"Goldberg","given":"Richie"},{"family":"Heng","given":"Lee"},{"family":"Hooker","given":"Josh"},{"family":"Hunt","given":"Leslie A."},{"family":"Ingwersen","given":"Joachim"},{"family":"Izaurralde","given":"Roberto C."},{"family":"Müller","given":"Christoph"},{"family":"Kumar","given":"Soora Naresh"},{"family":"Nendel","given":"Claas"},{"family":"O’Leary","given":"Garry J."},{"family":"Olesen","given":"Jørgen E."},{"family":"Osborne","given":"Tom M."},{"family":"Palosuo","given":"Taru"},{"family":"Priesack","given":"Eckart"},{"family":"Ripoche","given":"Dominique"},{"family":"Semenov","given":"Mikhail A."},{"family":"Shcherbak","given":"Iurii"},{"family":"Steduto","given":"Pasquale"},{"family":"Stöckle","given":"Claudio O."},{"family":"Stratonovitch","given":"Pierre"},{"family":"Streck","given":"Thilo"},{"family":"Supit","given":"Iwan"},{"family":"Tao","given":"Fulu"},{"family":"Travasso","given":"Maria"},{"family":"Waha","given":"Katharina"},{"family":"White","given":"Jeffrey W."},{"family":"Wolf","given":"Joost"}],"issued":{"date-parts":[[2016,11]]},"DOI":"10.1016/j.fcr.2016.08.015","URL":"https://doi.org/10.1016/j.fcr.2016.08.015","accessed":{"date-parts":[[2026,10,4]]},"container-title":"Field Crops Research","volume":"198","page":"80-92"}}],"schema":"https://github.com/citation-style-language/schema/raw/master/csl-citation.json"} </w:instrText>
       </w:r>
       <w:r>
         <w:fldChar w:fldCharType="separate"/>
       </w:r>
       <w:r>
-        <w:t>(Grafton et al., 2018; Perry et al., 2009)</w:t>
+        <w:t>(Cammarano et al., 2016)</w:t>
       </w:r>
       <w:r>
         <w:fldChar w:fldCharType="end"/>
       </w:r>
       <w:r>
-        <w:t>.</w:t>
+        <w:t>. Phenology, canopy, biomass, grain and ET observations therefore constrain complementary processes, while documented irrigation treatments assess their combined response to water supply. Continuous simulation retains the soil-water carry-over needed to compare complete rotation histories.</w:t>
       </w:r>
     </w:p>
     <w:p>
@@ -374,43 +392,43 @@
         <w:spacing w:line="480" w:lineRule="auto"/>
       </w:pPr>
       <w:r>
-        <w:t xml:space="preserve">Quantifying these trade-offs requires crop responses that connect canopy development, grain formation and soil-water depletion through successive seasons. Applications of APSIM and RZ-SHAW in the North China Plain provide process-based assessments of crop water productivity, field water balance and ET </w:t>
+        <w:t xml:space="preserve">Spatial allocation determines where irrigation is supplied, while antecedent hydrological conditions can inform the annual irrigation budget. Recent rainfall describes water input at the crop-system scale, whereas GRACE total water storage integrates several terrestrial stores over a regional footprint </w:t>
       </w:r>
       <w:r>
         <w:fldChar w:fldCharType="begin"/>
       </w:r>
       <w:r>
-        <w:instrText xml:space="preserve"> ADDIN ZOTERO_ITEM CSL_CITATION {"citationID":"48c8ed580247865a","properties":{"formattedCitation":"(Chen et al., 2010; Fang et al., 2014)","plainCitation":"(Chen et al., 2010; Fang et al., 2014)","noteIndex":0},"citationItems":[{"id":"chen2010_climate_water","itemData":{"id":"chen2010_climate_water","type":"article-journal","title":"Modelling the effects of climate variability and water management on crop water productivity and water balance in the North China Plain","author":[{"family":"Chen","given":"Chao"},{"family":"Wang","given":"Enli"},{"family":"Yu","given":"Qiang"}],"issued":{"date-parts":[[2010,8]]},"container-title":"Agricultural Water Management","container-title-short":"Agric. Water Manag.","volume":"97","DOI":"10.1016/j.agwat.2008.11.012","URL":"https://doi.org/10.1016/j.agwat.2008.11.012","accessed":{"date-parts":[[2026,10,3]]},"language":"en","publisher":"Elsevier BV","issue":"8","page":"1175-1184"}},{"id":"fang2014","itemData":{"id":"fang2014","type":"article-journal","title":"Modeling evapotranspiration and energy balance in a wheat–maize cropping system using the revised RZ-SHAW model","author":[{"given":"Q.X.","family":"Fang"},{"given":"L.","family":"Ma"},{"given":"G.N.","family":"Flerchinger"},{"given":"Z.","family":"Qi"},{"given":"L.R.","family":"Ahuja"},{"given":"H.T.","family":"Xing"},{"given":"J.","family":"Li"},{"given":"Q.","family":"Yu"}],"issued":{"date-parts":[[2014,8]]},"DOI":"10.1016/j.agrformet.2014.04.009","URL":"https://doi.org/10.1016/j.agrformet.2014.04.009","container-title":"Agricultural and Forest Meteorology","volume":"194","page":"218-229"}}],"schema":"https://github.com/citation-style-language/schema/raw/master/csl-citation.json"} </w:instrText>
+        <w:instrText xml:space="preserve"> ADDIN ZOTERO_ITEM CSL_CITATION {"citationID":"40c058327c598135","properties":{"formattedCitation":"(Save et al., 2016; Scanlon et al., 2016)","plainCitation":"(Save et al., 2016; Scanlon et al., 2016)","noteIndex":0},"citationItems":[{"id":"save2016_csr_mascons","itemData":{"id":"save2016_csr_mascons","type":"article-journal","title":"High‐resolution CSR GRACE RL05 mascons","author":[{"given":"Himanshu","family":"Save"},{"given":"Srinivas","family":"Bettadpur"},{"given":"Byron D.","family":"Tapley"}],"container-title":"Journal of Geophysical Research: Solid Earth","volume":"121","page":"7547-7569","issued":{"date-parts":[[2016,10]]},"DOI":"10.1002/2016jb013007","URL":"https://doi.org/10.1002/2016jb013007"}},{"id":"scanlon2016_grace_mascons","itemData":{"id":"scanlon2016_grace_mascons","type":"article-journal","title":"Global evaluation of new GRACE mascon products for hydrologic applications","author":[{"family":"Scanlon","given":"Bridget R."},{"family":"Zhang","given":"Zizhan"},{"family":"Save","given":"Himanshu"},{"family":"Wiese","given":"David N."},{"family":"Landerer","given":"Felix W."},{"family":"Long","given":"Di"},{"family":"Longuevergne","given":"Laurent"},{"family":"Chen","given":"Jianli"}],"issued":{"date-parts":[[2016,12]]},"DOI":"10.1002/2016wr019494","URL":"https://doi.org/10.1002/2016wr019494","accessed":{"date-parts":[[2026,10,4]]},"container-title":"Water Resources Research","volume":"52","issue":"12","page":"9412-9429"}}],"schema":"https://github.com/citation-style-language/schema/raw/master/csl-citation.json"} </w:instrText>
       </w:r>
       <w:r>
         <w:fldChar w:fldCharType="separate"/>
       </w:r>
       <w:r>
-        <w:t>(Chen et al., 2010; Fang et al., 2014)</w:t>
+        <w:t>(Save et al., 2016; Scanlon et al., 2016)</w:t>
       </w:r>
       <w:r>
         <w:fldChar w:fldCharType="end"/>
       </w:r>
       <w:r>
-        <w:t xml:space="preserve">. Transpiration formulation is a major source of variation in simulated water use among wheat models </w:t>
+        <w:t xml:space="preserve">. Recent aquifer recovery under water transfers, abstraction management and changing climate illustrates the broader context of regional storage variation </w:t>
       </w:r>
       <w:r>
         <w:fldChar w:fldCharType="begin"/>
       </w:r>
       <w:r>
-        <w:instrText xml:space="preserve"> ADDIN ZOTERO_ITEM CSL_CITATION {"citationID":"5a794b09ad195f81","properties":{"formattedCitation":"(Cammarano et al., 2016)","plainCitation":"(Cammarano et al., 2016)","noteIndex":0},"citationItems":[{"id":"cammarano2016_water_use","itemData":{"id":"cammarano2016_water_use","type":"article-journal","title":"Uncertainty of wheat water use: Simulated patterns and sensitivity to temperature and CO2","author":[{"family":"Cammarano","given":"Davide"},{"family":"Rötter","given":"Reimund P."},{"family":"Asseng","given":"Senthold"},{"family":"Ewert","given":"Frank"},{"family":"Wallach","given":"Daniel"},{"family":"Martre","given":"Pierre"},{"family":"Hatfield","given":"Jerry L."},{"family":"Jones","given":"James W."},{"family":"Rosenzweig","given":"Cynthia"},{"family":"Ruane","given":"Alex C."},{"family":"Boote","given":"Kenneth J."},{"family":"Thorburn","given":"Peter J."},{"family":"Kersebaum","given":"Kurt Christian"},{"family":"Aggarwal","given":"Pramod K."},{"family":"Angulo","given":"Carlos"},{"family":"Basso","given":"Bruno"},{"family":"Bertuzzi","given":"Patrick"},{"family":"Biernath","given":"Christian"},{"family":"Brisson","given":"Nadine"},{"family":"Challinor","given":"Andrew J."},{"family":"Doltra","given":"Jordi"},{"family":"Gayler","given":"Sebastian"},{"family":"Goldberg","given":"Richie"},{"family":"Heng","given":"Lee"},{"family":"Hooker","given":"Josh"},{"family":"Hunt","given":"Leslie A."},{"family":"Ingwersen","given":"Joachim"},{"family":"Izaurralde","given":"Roberto C."},{"family":"Müller","given":"Christoph"},{"family":"Kumar","given":"Soora Naresh"},{"family":"Nendel","given":"Claas"},{"family":"O’Leary","given":"Garry J."},{"family":"Olesen","given":"Jørgen E."},{"family":"Osborne","given":"Tom M."},{"family":"Palosuo","given":"Taru"},{"family":"Priesack","given":"Eckart"},{"family":"Ripoche","given":"Dominique"},{"family":"Semenov","given":"Mikhail A."},{"family":"Shcherbak","given":"Iurii"},{"family":"Steduto","given":"Pasquale"},{"family":"Stöckle","given":"Claudio O."},{"family":"Stratonovitch","given":"Pierre"},{"family":"Streck","given":"Thilo"},{"family":"Supit","given":"Iwan"},{"family":"Tao","given":"Fulu"},{"family":"Travasso","given":"Maria"},{"family":"Waha","given":"Katharina"},{"family":"White","given":"Jeffrey W."},{"family":"Wolf","given":"Joost"}],"issued":{"date-parts":[[2016,11]]},"DOI":"10.1016/j.fcr.2016.08.015","URL":"https://doi.org/10.1016/j.fcr.2016.08.015","accessed":{"date-parts":[[2026,10,4]]},"container-title":"Field Crops Research","volume":"198","page":"80-92"}}],"schema":"https://github.com/citation-style-language/schema/raw/master/csl-citation.json"} </w:instrText>
+        <w:instrText xml:space="preserve"> ADDIN ZOTERO_ITEM CSL_CITATION {"citationID":"7382b3e325c4dde9","properties":{"formattedCitation":"(Long et al., 2025; Xu et al., 2026)","plainCitation":"(Long et al., 2025; Xu et al., 2026)","noteIndex":0},"citationItems":[{"id":"long2025_aquifer_recovery","itemData":{"id":"long2025_aquifer_recovery","type":"article-journal","title":"Unprecedented large-scale aquifer recovery through human intervention","author":[{"family":"Long","given":"Di"},{"family":"Xu","given":"Yuancheng"},{"family":"Cui","given":"Yingjie"},{"family":"Cui","given":"Yanhong"},{"family":"Butler","given":"James J."},{"family":"Dong","given":"Liang"},{"family":"Wang","given":"Longfeng"},{"family":"Liu","given":"Dongyong"},{"family":"Wada","given":"Yoshihide"},{"family":"Hu","given":"Litang"},{"family":"Bai","given":"Guoying"},{"family":"Li","given":"Binghua"},{"family":"Wang","given":"Shufang"},{"family":"Nong","given":"Xizhi"},{"family":"Cai","given":"Yang"},{"family":"Cheng","given":"Chunsheng"},{"family":"Mu","given":"Yuhan"},{"family":"Qiao","given":"Yu"},{"family":"Wang","given":"Jianhua"},{"family":"Wang","given":"Hao"},{"family":"Scanlon","given":"Bridget R."}],"issued":{"date-parts":[[2025,8,7]]},"container-title":"Nature Communications","container-title-short":"Nat. Commun.","volume":"16","DOI":"10.1038/s41467-025-62719-5","URL":"https://doi.org/10.1038/s41467-025-62719-5","accessed":{"date-parts":[[2026,10,3]]},"language":"en","publisher":"Springer Science and Business Media LLC","issue":"1","page":"7296"}},{"id":"xu2026_groundwater_recovery","itemData":{"id":"xu2026_groundwater_recovery","type":"article-journal","title":"Quantifying Human and Climatic Contributions of Large‐Scale Groundwater Recovery in the North China Plain","author":[{"family":"Xu","given":"Yuancheng"},{"family":"Long","given":"Di"},{"family":"Jiang","given":"Wenyu"},{"family":"Cui","given":"Yingjie"},{"family":"Chen","given":"Fei"},{"family":"Wang","given":"Jianhua"},{"family":"Wada","given":"Yoshihide"}],"issued":{"date-parts":[[2026,7]]},"container-title":"Water Resources Research","container-title-short":"Water Resour. Res.","volume":"62","DOI":"10.1029/2025wr043052","URL":"https://doi.org/10.1029/2025wr043052","accessed":{"date-parts":[[2026,10,3]]},"language":"en","publisher":"American Geophysical Union (AGU)","issue":"7","page":"e2025WR043052"}}],"schema":"https://github.com/citation-style-language/schema/raw/master/csl-citation.json"} </w:instrText>
       </w:r>
       <w:r>
         <w:fldChar w:fldCharType="separate"/>
       </w:r>
       <w:r>
-        <w:t>(Cammarano et al., 2016)</w:t>
+        <w:t>(Long et al., 2025; Xu et al., 2026)</w:t>
       </w:r>
       <w:r>
         <w:fldChar w:fldCharType="end"/>
       </w:r>
       <w:r>
-        <w:t>. Yield agreement alone therefore provides incomplete evidence about the water cost of production or the production response to additional irrigation. Phenology, canopy, biomass, grain and ET observations constrain complementary processes, while documented irrigation treatments identify their combined response to water supply. Continuous simulation preserves the soil-water carry-over required to compare complete management histories.</w:t>
+        <w:t>. Storage information may thus characterize conditions beyond local rainfall. Its practical value for irrigation nevertheless depends on whether it changes the selected action or improves the resulting grain–water outcome relative to rainfall-based decisions.</w:t>
       </w:r>
     </w:p>
     <w:p>
@@ -418,25 +436,7 @@
         <w:spacing w:line="480" w:lineRule="auto"/>
       </w:pPr>
       <w:r>
-        <w:t xml:space="preserve">Spatial allocation determines where a regional irrigation budget is delivered; antecedent environmental information can also determine how large that budget should be in a particular year. Recent rainfall describes water input, whereas GRACE total water storage integrates several terrestrial stores over a regional footprint </w:t>
-      </w:r>
-      <w:r>
-        <w:fldChar w:fldCharType="begin"/>
-      </w:r>
-      <w:r>
-        <w:instrText xml:space="preserve"> ADDIN ZOTERO_ITEM CSL_CITATION {"citationID":"b13abe2fbc51ef0c","properties":{"formattedCitation":"(Save et al., 2016; Scanlon et al., 2016)","plainCitation":"(Save et al., 2016; Scanlon et al., 2016)","noteIndex":0},"citationItems":[{"id":"save2016_csr_mascons","itemData":{"id":"save2016_csr_mascons","type":"article-journal","title":"High‐resolution CSR GRACE RL05 mascons","author":[{"given":"Himanshu","family":"Save"},{"given":"Srinivas","family":"Bettadpur"},{"given":"Byron D.","family":"Tapley"}],"container-title":"Journal of Geophysical Research: Solid Earth","volume":"121","page":"7547-7569","issued":{"date-parts":[[2016,10]]},"DOI":"10.1002/2016jb013007","URL":"https://doi.org/10.1002/2016jb013007"}},{"id":"scanlon2016_grace_mascons","itemData":{"id":"scanlon2016_grace_mascons","type":"article-journal","title":"Global evaluation of new GRACE mascon products for hydrologic applications","author":[{"family":"Scanlon","given":"Bridget R."},{"family":"Zhang","given":"Zizhan"},{"family":"Save","given":"Himanshu"},{"family":"Wiese","given":"David N."},{"family":"Landerer","given":"Felix W."},{"family":"Long","given":"Di"},{"family":"Longuevergne","given":"Laurent"},{"family":"Chen","given":"Jianli"}],"issued":{"date-parts":[[2016,12]]},"DOI":"10.1002/2016wr019494","URL":"https://doi.org/10.1002/2016wr019494","accessed":{"date-parts":[[2026,10,4]]},"container-title":"Water Resources Research","volume":"52","issue":"12","page":"9412-9429"}}],"schema":"https://github.com/citation-style-language/schema/raw/master/csl-citation.json"} </w:instrText>
-      </w:r>
-      <w:r>
-        <w:fldChar w:fldCharType="separate"/>
-      </w:r>
-      <w:r>
-        <w:t>(Save et al., 2016; Scanlon et al., 2016)</w:t>
-      </w:r>
-      <w:r>
-        <w:fldChar w:fldCharType="end"/>
-      </w:r>
-      <w:r>
-        <w:t>. The storage indicator can thus describe conditions beyond local rainfall, but additional environmental information has management value only when it changes the selected action or its grain–water outcome. Storage–rainfall strategies require comparison with rainfall-only strategies under common selection criteria and monitoring availability. This comparison separates the physical relevance of a hydrological indicator from its incremental value for the available irrigation choices.</w:t>
+        <w:t>Two connected management questions remain unresolved. First, it is unclear how much grain spatial targeting can retain under an identical irrigation budget, and what consumptive-water costs and persistent local production losses accompany that regional benefit. Rotation-wide accounting must retain soil-water carry-over to assess these outcomes together. Second, the additional decision value of regional storage information beyond antecedent rainfall remains uncertain. A storage indicator can distinguish hydrological conditions without changing an irrigation choice. Comparisons using the same production targets, candidate quotas and monitoring availability are needed to isolate its contribution to management outcomes.</w:t>
       </w:r>
     </w:p>
     <w:p>
@@ -444,7 +444,7 @@
         <w:spacing w:line="480" w:lineRule="auto"/>
       </w:pPr>
       <w:r>
-        <w:t>Spatial irrigation allocation and antecedent rainfall–storage strategies were compared for the North China Plain wheat–maize rotation using Open Crop Model. Multisite observations supplied crop-growth parameter estimates, and documented Wuqiao treatments in 2016–2018 constrained water-response coefficients. The 2019 field observations provided retrospective testing, while station comparisons characterized transfer under their available management information. Continuous regional simulations compared uniform and targeted allocations under identical irrigation budgets and annual storage–rainfall strategies against matched rainfall-only controls. Production retention, consumptive ET, profile drainage and the spatial and annual distribution of grain changes define the management trade-offs.</w:t>
+        <w:t>The objectives were to (i) quantify rotation grain production, crop-plus-fallow ET and profile drainage under uniform and spatially targeted irrigation allocations with common regional water budgets; (ii) characterize the spatial distribution, magnitude and annual persistence of allocation-related grain gains and losses; and (iii) assess whether antecedent regional storage information changes annual irrigation quotas and grain–water outcomes relative to rainfall-only controls under matched selection and monitoring conditions. Continuous Open Crop Model simulations of the North China Plain wheat–maize rotation, parameterized using multisite crop observations and documented irrigation treatments, provide the basis for these conditional comparisons during 2014–2025.</w:t>
       </w:r>
     </w:p>
     <w:p>
@@ -7761,7 +7761,7 @@
         <w:spacing w:line="480" w:lineRule="auto"/>
       </w:pPr>
       <w:r>
-        <w:t>The simulations reveal three linked dimensions of irrigation management: production retained under a delivery constraint, consumptive water use and the distribution of production changes. Spatial targeting improves regional grain production by assigning a fixed budget to more responsive crop–soil–climate systems. Annual rainfall–storage strategies instead change the delivered quota in response to antecedent conditions. Both decisions operate through crop stress and the soil water carried between wheat, maize and fallow periods. Their management value consequently depends on the complete rotation response, the accounting boundary used to define a water saving and the reliability of the crop responses underlying selection.</w:t>
+        <w:t>We used a calibrated crop model to simulate continuous winter wheat–summer maize rotations across the North China Plain, compare uniform and spatially targeted irrigation under equal water budgets, and test whether antecedent regional water storage improved decisions based on rainfall. Sustaining grain production under restricted irrigation requires consideration of both consumptive water use and the distribution of production losses across locations. The conditional results show that higher regional grain retention can accompany greater evapotranspiration and lower production in some locations, whereas storage information did not change the selected irrigation quotas within the tested design. The management value of these strategies therefore depends on accounting for the complete rotation water balance, soil-water carry-over across crops and fallows, and reliable crop responses to irrigation.</w:t>
       </w:r>
     </w:p>
     <w:p>
@@ -8323,7 +8323,7 @@
         <w:ind w:left="288" w:hanging="288"/>
       </w:pPr>
       <w:r>
-        <w:t>Long, D., Xu, Y., Cui, Y., Cui, Y., Butler, J.J., Dong, L., Wang, L., Liu, D., Wada, Y., Hu, L., Bai, G., Li, B., Wang, S., Nong, X., Cai, Y., Cheng, C., Mu, Y., Qiao, Y., Wang, J., Wang, H., Scanlon, B.R., 2025. Unprecedented large-scale aquifer recovery through human intervention. Nat. Commun. 16, 7296. https://doi.org/10.1038/s41467-025-62719-5</w:t>
+        <w:t>Wu, D., Fang, S., Li, X., He, D., Zhu, Y., Yang, Z., Xu, J., Wu, Y., 2019. Spatial-temporal variation in irrigation water requirement for the winter wheat-summer maize rotation system since the 1980s on the North China Plain. Agric. Water Manag. 214, 78–86. https://doi.org/10.1016/j.agwat.2019.01.004</w:t>
       </w:r>
     </w:p>
     <w:p>
@@ -8332,7 +8332,7 @@
         <w:ind w:left="288" w:hanging="288"/>
       </w:pPr>
       <w:r>
-        <w:t>Xu, Y., Long, D., Jiang, W., Cui, Y., Chen, F., Wang, J., Wada, Y., 2026. Quantifying Human and Climatic Contributions of Large‐Scale Groundwater Recovery in the North China Plain. Water Resour. Res. 62, e2025WR043052. https://doi.org/10.1029/2025wr043052</w:t>
+        <w:t>Ren, P., Huang, F., Li, B., 2022. Spatiotemporal patterns of water consumption and irrigation requirements of wheat-maize in the Huang-Huai-Hai Plain, China and options of their reduction. Agric. Water Manag. 263, 107468. https://doi.org/10.1016/j.agwat.2022.107468</w:t>
       </w:r>
     </w:p>
     <w:p>
@@ -8341,7 +8341,7 @@
         <w:ind w:left="288" w:hanging="288"/>
       </w:pPr>
       <w:r>
-        <w:t>Wu, D., Fang, S., Li, X., He, D., Zhu, Y., Yang, Z., Xu, J., Wu, Y., 2019. Spatial-temporal variation in irrigation water requirement for the winter wheat-summer maize rotation system since the 1980s on the North China Plain. Agric. Water Manag. 214, 78–86. https://doi.org/10.1016/j.agwat.2019.01.004</w:t>
+        <w:t>Xiao, L., Wang, G., Wang, E., Liu, S., Chang, J., Zhang, P., Zhou, H., Wei, Y., Zhang, H., Zhu, Y., Shi, Z., Luo, Z., 2024. Spatiotemporal co-optimization of agricultural management practices towards climate-smart crop production. Nature Food 5, 59–71. https://doi.org/10.1038/s43016-023-00891-x</w:t>
       </w:r>
     </w:p>
     <w:p>
@@ -8350,7 +8350,7 @@
         <w:ind w:left="288" w:hanging="288"/>
       </w:pPr>
       <w:r>
-        <w:t>Ren, P., Huang, F., Li, B., 2022. Spatiotemporal patterns of water consumption and irrigation requirements of wheat-maize in the Huang-Huai-Hai Plain, China and options of their reduction. Agric. Water Manag. 263, 107468. https://doi.org/10.1016/j.agwat.2022.107468</w:t>
+        <w:t>Jiang, Y., Xu, X., Huang, Q., Huo, Z., Huang, G., 2016. Optimizing regional irrigation water use by integrating a two-level optimization model and an agro-hydrological model. Agricultural Water Management 178, 76–88. https://doi.org/10.1016/j.agwat.2016.08.035</w:t>
       </w:r>
     </w:p>
     <w:p>
@@ -8359,7 +8359,7 @@
         <w:ind w:left="288" w:hanging="288"/>
       </w:pPr>
       <w:r>
-        <w:t>Xiao, L., Wang, G., Wang, E., Liu, S., Chang, J., Zhang, P., Zhou, H., Wei, Y., Zhang, H., Zhu, Y., Shi, Z., Luo, Z., 2024. Spatiotemporal co-optimization of agricultural management practices towards climate-smart crop production. Nature Food 5, 59–71. https://doi.org/10.1038/s43016-023-00891-x</w:t>
+        <w:t>Perry, C., Steduto, P., Allen, R.G., Burt, C.M., 2009. Increasing productivity in irrigated agriculture: Agronomic constraints and hydrological realities. Agric. Water Manag. 96, 1517–1524. https://doi.org/10.1016/j.agwat.2009.05.005</w:t>
       </w:r>
     </w:p>
     <w:p>
@@ -8368,7 +8368,7 @@
         <w:ind w:left="288" w:hanging="288"/>
       </w:pPr>
       <w:r>
-        <w:t>Jiang, Y., Xu, X., Huang, Q., Huo, Z., Huang, G., 2016. Optimizing regional irrigation water use by integrating a two-level optimization model and an agro-hydrological model. Agricultural Water Management 178, 76–88. https://doi.org/10.1016/j.agwat.2016.08.035</w:t>
+        <w:t>Grafton, R.Q., Williams, J., Perry, C.J., Molle, F., Ringler, C., Steduto, P., Udall, B., Wheeler, S.A., Wang, Y., Garrick, D., Allen, R.G., 2018. The paradox of irrigation efficiency. Science 361, 748–750. https://doi.org/10.1126/science.aat9314</w:t>
       </w:r>
     </w:p>
     <w:p>
@@ -8377,7 +8377,7 @@
         <w:ind w:left="288" w:hanging="288"/>
       </w:pPr>
       <w:r>
-        <w:t>Perry, C., Steduto, P., Allen, R.G., Burt, C.M., 2009. Increasing productivity in irrigated agriculture: Agronomic constraints and hydrological realities. Agric. Water Manag. 96, 1517–1524. https://doi.org/10.1016/j.agwat.2009.05.005</w:t>
+        <w:t>Chen, C., Wang, E., Yu, Q., 2010. Modelling the effects of climate variability and water management on crop water productivity and water balance in the North China Plain. Agric. Water Manag. 97, 1175–1184. https://doi.org/10.1016/j.agwat.2008.11.012</w:t>
       </w:r>
     </w:p>
     <w:p>
@@ -8386,7 +8386,7 @@
         <w:ind w:left="288" w:hanging="288"/>
       </w:pPr>
       <w:r>
-        <w:t>Grafton, R.Q., Williams, J., Perry, C.J., Molle, F., Ringler, C., Steduto, P., Udall, B., Wheeler, S.A., Wang, Y., Garrick, D., Allen, R.G., 2018. The paradox of irrigation efficiency. Science 361, 748–750. https://doi.org/10.1126/science.aat9314</w:t>
+        <w:t>Fang, Q.X., Ma, L., Flerchinger, G.N., Qi, Z., Ahuja, L.R., Xing, H.T., Li, J., Yu, Q., 2014. Modeling evapotranspiration and energy balance in a wheat–maize cropping system using the revised RZ-SHAW model. Agricultural and Forest Meteorology 194, 218–229. https://doi.org/10.1016/j.agrformet.2014.04.009</w:t>
       </w:r>
     </w:p>
     <w:p>
@@ -8395,7 +8395,7 @@
         <w:ind w:left="288" w:hanging="288"/>
       </w:pPr>
       <w:r>
-        <w:t>Chen, C., Wang, E., Yu, Q., 2010. Modelling the effects of climate variability and water management on crop water productivity and water balance in the North China Plain. Agric. Water Manag. 97, 1175–1184. https://doi.org/10.1016/j.agwat.2008.11.012</w:t>
+        <w:t>Cammarano, D., Rötter, R.P., Asseng, S., Ewert, F., Wallach, D., Martre, P., Hatfield, J.L., Jones, J.W., Rosenzweig, C., Ruane, A.C., Boote, K.J., Thorburn, P.J., Kersebaum, K.C., Aggarwal, P.K., Angulo, C., Basso, B., Bertuzzi, P., Biernath, C., Brisson, N., Challinor, A.J., Doltra, J., Gayler, S., Goldberg, R., Heng, L., Hooker, J., Hunt, L.A., Ingwersen, J., Izaurralde, R.C., Müller, C., Kumar, S.N., Nendel, C., O’Leary, G.J., Olesen, J.E., Osborne, T.M., Palosuo, T., Priesack, E., Ripoche, D., Semenov, M.A., Shcherbak, I., Steduto, P., Stöckle, C.O., Stratonovitch, P., Streck, T., Supit, I., Tao, F., Travasso, M., Waha, K., White, J.W., Wolf, J., 2016. Uncertainty of wheat water use: Simulated patterns and sensitivity to temperature and CO2. Field Crops Research 198, 80–92. https://doi.org/10.1016/j.fcr.2016.08.015</w:t>
       </w:r>
     </w:p>
     <w:p>
@@ -8404,7 +8404,7 @@
         <w:ind w:left="288" w:hanging="288"/>
       </w:pPr>
       <w:r>
-        <w:t>Fang, Q.X., Ma, L., Flerchinger, G.N., Qi, Z., Ahuja, L.R., Xing, H.T., Li, J., Yu, Q., 2014. Modeling evapotranspiration and energy balance in a wheat–maize cropping system using the revised RZ-SHAW model. Agricultural and Forest Meteorology 194, 218–229. https://doi.org/10.1016/j.agrformet.2014.04.009</w:t>
+        <w:t>Save, H., Bettadpur, S., Tapley, B.D., 2016. High‐resolution CSR GRACE RL05 mascons. Journal of Geophysical Research: Solid Earth 121, 7547–7569. https://doi.org/10.1002/2016jb013007</w:t>
       </w:r>
     </w:p>
     <w:p>
@@ -8413,7 +8413,7 @@
         <w:ind w:left="288" w:hanging="288"/>
       </w:pPr>
       <w:r>
-        <w:t>Cammarano, D., Rötter, R.P., Asseng, S., Ewert, F., Wallach, D., Martre, P., Hatfield, J.L., Jones, J.W., Rosenzweig, C., Ruane, A.C., Boote, K.J., Thorburn, P.J., Kersebaum, K.C., Aggarwal, P.K., Angulo, C., Basso, B., Bertuzzi, P., Biernath, C., Brisson, N., Challinor, A.J., Doltra, J., Gayler, S., Goldberg, R., Heng, L., Hooker, J., Hunt, L.A., Ingwersen, J., Izaurralde, R.C., Müller, C., Kumar, S.N., Nendel, C., O’Leary, G.J., Olesen, J.E., Osborne, T.M., Palosuo, T., Priesack, E., Ripoche, D., Semenov, M.A., Shcherbak, I., Steduto, P., Stöckle, C.O., Stratonovitch, P., Streck, T., Supit, I., Tao, F., Travasso, M., Waha, K., White, J.W., Wolf, J., 2016. Uncertainty of wheat water use: Simulated patterns and sensitivity to temperature and CO2. Field Crops Research 198, 80–92. https://doi.org/10.1016/j.fcr.2016.08.015</w:t>
+        <w:t>Scanlon, B.R., Zhang, Z., Save, H., Wiese, D.N., Landerer, F.W., Long, D., Longuevergne, L., Chen, J., 2016. Global evaluation of new GRACE mascon products for hydrologic applications. Water Resources Research 52, 9412–9429. https://doi.org/10.1002/2016wr019494</w:t>
       </w:r>
     </w:p>
     <w:p>
@@ -8422,7 +8422,7 @@
         <w:ind w:left="288" w:hanging="288"/>
       </w:pPr>
       <w:r>
-        <w:t>Save, H., Bettadpur, S., Tapley, B.D., 2016. High‐resolution CSR GRACE RL05 mascons. Journal of Geophysical Research: Solid Earth 121, 7547–7569. https://doi.org/10.1002/2016jb013007</w:t>
+        <w:t>Long, D., Xu, Y., Cui, Y., Cui, Y., Butler, J.J., Dong, L., Wang, L., Liu, D., Wada, Y., Hu, L., Bai, G., Li, B., Wang, S., Nong, X., Cai, Y., Cheng, C., Mu, Y., Qiao, Y., Wang, J., Wang, H., Scanlon, B.R., 2025. Unprecedented large-scale aquifer recovery through human intervention. Nat. Commun. 16, 7296. https://doi.org/10.1038/s41467-025-62719-5</w:t>
       </w:r>
     </w:p>
     <w:p>
@@ -8431,7 +8431,7 @@
         <w:ind w:left="288" w:hanging="288"/>
       </w:pPr>
       <w:r>
-        <w:t>Scanlon, B.R., Zhang, Z., Save, H., Wiese, D.N., Landerer, F.W., Long, D., Longuevergne, L., Chen, J., 2016. Global evaluation of new GRACE mascon products for hydrologic applications. Water Resources Research 52, 9412–9429. https://doi.org/10.1002/2016wr019494</w:t>
+        <w:t>Xu, Y., Long, D., Jiang, W., Cui, Y., Chen, F., Wang, J., Wada, Y., 2026. Quantifying Human and Climatic Contributions of Large‐Scale Groundwater Recovery in the North China Plain. Water Resour. Res. 62, e2025WR043052. https://doi.org/10.1029/2025wr043052</w:t>
       </w:r>
     </w:p>
     <w:p>

</xml_diff>

<commit_message>
Publish a verified and internally consistent manuscript snapshot
</commit_message>
<xml_diff>
--- a/model/current_results/publication/documents/manuscript.docx
+++ b/model/current_results/publication/documents/manuscript.docx
@@ -8207,6 +8207,47 @@
     </w:p>
     <w:p>
       <w:pPr>
+        <w:pStyle w:val="Heading2"/>
+        <w:spacing w:line="480" w:lineRule="auto"/>
+      </w:pPr>
+      <w:r>
+        <w:t>4.6. Limitations and future directions</w:t>
+      </w:r>
+    </w:p>
+    <w:p>
+      <w:pPr>
+        <w:spacing w:line="480" w:lineRule="auto"/>
+      </w:pPr>
+      <w:r>
+        <w:t>The principal limitation is uncertainty in the crop responses used for strategy selection. Field testing covers a single, previously inspected year, while incomplete station management and assumed initial water profiles constrain transfer. Remaining errors in ET and grain responses prevent the simulated policy advantages from being interpreted as independently validated field benefits. Further evaluation requires new site-years with complete management records, withheld from both model development and strategy selection. Concurrent measurements of soil water by depth, ET, canopy development and harvest would allow separate assessment of water redistribution, crop stress and irrigation-treatment contrasts.</w:t>
+      </w:r>
+    </w:p>
+    <w:p>
+      <w:pPr>
+        <w:spacing w:line="480" w:lineRule="auto"/>
+      </w:pPr>
+      <w:r>
+        <w:t>Regional results also depend on a static rotation map, representative climate–soil units, prescribed irrigation dates and fixed nutrition modifiers. Checks at purposively selected source cells cannot bound regional uncertainty. Dynamic nitrogen cycling is absent, and changes in crop area or actual farm practices are not reconstructed. Future analyses should expand evaluation at individual source cells and propagate uncertainty in crop parameters, soil hydraulics, weather and spatial aggregation through paired policy histories. Allocation stability and the magnitude and persistence of local losses require uncertainty assessment alongside the regional mean.</w:t>
+      </w:r>
+    </w:p>
+    <w:p>
+      <w:pPr>
+        <w:spacing w:line="480" w:lineRule="auto"/>
+      </w:pPr>
+      <w:r>
+        <w:t>The storage comparison is specific to the tested quota grid, classification thresholds and lower-storage conditions represented during later comparison years. GRACE release availability before sowing remains unverified, so the scenarios do not establish operational scheduling performance. Prospective decision experiments should use information available on each decision date, maintain matched rainfall-only controls and evaluate both storage states. Finer quotas and application timing informed by soil water could be tested with constraints on consumptive use, local production and the risk of production shortfalls.</w:t>
+      </w:r>
+    </w:p>
+    <w:p>
+      <w:pPr>
+        <w:spacing w:line="480" w:lineRule="auto"/>
+      </w:pPr>
+      <w:r>
+        <w:t>Finally, the profile uses free drainage at its lower boundary, with no capillary supply or deeper subsurface storage, and field irrigation is not linked to measured abstraction. Groundwater applications require joint accounting of soil water and aquifer flows, constrained by observations of pumping, recharge and storage change. Delivery capacity, irrigation costs and farmer participation also require assessment before the agronomic scenarios can support operational management.</w:t>
+      </w:r>
+    </w:p>
+    <w:p>
+      <w:pPr>
         <w:pStyle w:val="Heading1"/>
         <w:spacing w:line="480" w:lineRule="auto"/>
       </w:pPr>

</xml_diff>